<commit_message>
Add Ashaar Normal body style; right-align footnote text + separator
RTL setup now creates a named "Ashaar Normal" paragraph style (right-aligned
+ complex-script font/size) instead of mutating the built-in Normal, keeping
built-ins pristine per the spec. It also right-aligns the built-in "Footnote
Text" style so footnote text sits on the right in an RTL document.

Office.js exposes no paragraph reading-order/bidi setter and no access to the
footnote separator (a special id=-1 footnote), so: (a) right-alignment is the
closest RTL lever for body/footnote paragraphs, and (b) the footnote separator
line is right-aligned in the test-doc generator's footnotes.xml (the only
programmatic route) with the in-pane note pointing to Word's Draft-view step
for existing docs. UI note + asset version updated accordingly.

Co-Authored-By: Claude Opus 4.8 <noreply@anthropic.com>
</commit_message>
<xml_diff>
--- a/test-documents/styles-test.docx
+++ b/test-documents/styles-test.docx
@@ -244,6 +244,8 @@
   <w:footnote w:type="separator" w:id="-1">
     <w:p>
       <w:pPr>
+        <w:bidi/>
+        <w:jc w:val="right"/>
         <w:spacing w:after="0" w:line="240" w:lineRule="auto"/>
       </w:pPr>
       <w:r>
@@ -254,6 +256,8 @@
   <w:footnote w:type="continuationSeparator" w:id="0">
     <w:p>
       <w:pPr>
+        <w:bidi/>
+        <w:jc w:val="right"/>
         <w:spacing w:after="0" w:line="240" w:lineRule="auto"/>
       </w:pPr>
       <w:r>

</xml_diff>